<commit_message>
Added changelog section to SRS with entries
</commit_message>
<xml_diff>
--- a/SRS_v1.1.docx
+++ b/SRS_v1.1.docx
@@ -146,24 +146,44 @@
           <w:sz w:val="26"/>
           <w:szCs w:val="26"/>
         </w:rPr>
-        <w:t>System Name: TaskAnchor</w:t>
-      </w:r>
-    </w:p>
-    <w:p>
-      <w:pPr>
-        <w:rPr>
-          <w:rFonts w:ascii="Arial" w:eastAsia="Arial" w:hAnsi="Arial" w:cs="Arial"/>
-          <w:sz w:val="26"/>
-          <w:szCs w:val="26"/>
-        </w:rPr>
-      </w:pPr>
-      <w:r>
-        <w:rPr>
-          <w:rFonts w:ascii="Arial" w:eastAsia="Arial" w:hAnsi="Arial" w:cs="Arial"/>
-          <w:sz w:val="26"/>
-          <w:szCs w:val="26"/>
-        </w:rPr>
-        <w:t>TaskAnchor is the product name for the Priority Task Management System.</w:t>
+        <w:t xml:space="preserve">System Name: </w:t>
+      </w:r>
+      <w:proofErr w:type="spellStart"/>
+      <w:r>
+        <w:rPr>
+          <w:rFonts w:ascii="Arial" w:eastAsia="Arial" w:hAnsi="Arial" w:cs="Arial"/>
+          <w:sz w:val="26"/>
+          <w:szCs w:val="26"/>
+        </w:rPr>
+        <w:t>TaskAnchor</w:t>
+      </w:r>
+      <w:proofErr w:type="spellEnd"/>
+    </w:p>
+    <w:p>
+      <w:pPr>
+        <w:rPr>
+          <w:rFonts w:ascii="Arial" w:eastAsia="Arial" w:hAnsi="Arial" w:cs="Arial"/>
+          <w:sz w:val="26"/>
+          <w:szCs w:val="26"/>
+        </w:rPr>
+      </w:pPr>
+      <w:proofErr w:type="spellStart"/>
+      <w:r>
+        <w:rPr>
+          <w:rFonts w:ascii="Arial" w:eastAsia="Arial" w:hAnsi="Arial" w:cs="Arial"/>
+          <w:sz w:val="26"/>
+          <w:szCs w:val="26"/>
+        </w:rPr>
+        <w:t>TaskAnchor</w:t>
+      </w:r>
+      <w:proofErr w:type="spellEnd"/>
+      <w:r>
+        <w:rPr>
+          <w:rFonts w:ascii="Arial" w:eastAsia="Arial" w:hAnsi="Arial" w:cs="Arial"/>
+          <w:sz w:val="26"/>
+          <w:szCs w:val="26"/>
+        </w:rPr>
+        <w:t xml:space="preserve"> is the product name for the Priority Task Management System.</w:t>
       </w:r>
     </w:p>
     <w:p>
@@ -566,7 +586,25 @@
           <w:sz w:val="26"/>
           <w:szCs w:val="26"/>
         </w:rPr>
-        <w:t>- NextAction tracking</w:t>
+        <w:t xml:space="preserve">- </w:t>
+      </w:r>
+      <w:proofErr w:type="spellStart"/>
+      <w:r>
+        <w:rPr>
+          <w:rFonts w:ascii="Arial" w:eastAsia="Arial" w:hAnsi="Arial" w:cs="Arial"/>
+          <w:sz w:val="26"/>
+          <w:szCs w:val="26"/>
+        </w:rPr>
+        <w:t>NextAction</w:t>
+      </w:r>
+      <w:proofErr w:type="spellEnd"/>
+      <w:r>
+        <w:rPr>
+          <w:rFonts w:ascii="Arial" w:eastAsia="Arial" w:hAnsi="Arial" w:cs="Arial"/>
+          <w:sz w:val="26"/>
+          <w:szCs w:val="26"/>
+        </w:rPr>
+        <w:t xml:space="preserve"> tracking</w:t>
       </w:r>
     </w:p>
     <w:p>
@@ -1167,59 +1205,123 @@
           <w:sz w:val="26"/>
           <w:szCs w:val="26"/>
         </w:rPr>
-        <w:t>- PriorityLevel (Low, Medium, High)</w:t>
-      </w:r>
-    </w:p>
-    <w:p>
-      <w:pPr>
-        <w:rPr>
-          <w:rFonts w:ascii="Arial" w:eastAsia="Arial" w:hAnsi="Arial" w:cs="Arial"/>
-          <w:sz w:val="26"/>
-          <w:szCs w:val="26"/>
-        </w:rPr>
-      </w:pPr>
-      <w:r>
-        <w:rPr>
-          <w:rFonts w:ascii="Arial" w:eastAsia="Arial" w:hAnsi="Arial" w:cs="Arial"/>
-          <w:sz w:val="26"/>
-          <w:szCs w:val="26"/>
-        </w:rPr>
-        <w:t>- DueDate (optional)</w:t>
-      </w:r>
-    </w:p>
-    <w:p>
-      <w:pPr>
-        <w:rPr>
-          <w:rFonts w:ascii="Arial" w:eastAsia="Arial" w:hAnsi="Arial" w:cs="Arial"/>
-          <w:sz w:val="26"/>
-          <w:szCs w:val="26"/>
-        </w:rPr>
-      </w:pPr>
-      <w:r>
-        <w:rPr>
-          <w:rFonts w:ascii="Arial" w:eastAsia="Arial" w:hAnsi="Arial" w:cs="Arial"/>
-          <w:sz w:val="26"/>
-          <w:szCs w:val="26"/>
-        </w:rPr>
-        <w:t>- NextAction (optional)</w:t>
-      </w:r>
-    </w:p>
-    <w:p>
-      <w:pPr>
-        <w:rPr>
-          <w:rFonts w:ascii="Arial" w:eastAsia="Arial" w:hAnsi="Arial" w:cs="Arial"/>
-          <w:sz w:val="26"/>
-          <w:szCs w:val="26"/>
-        </w:rPr>
-      </w:pPr>
-      <w:r>
-        <w:rPr>
-          <w:rFonts w:ascii="Arial" w:eastAsia="Arial" w:hAnsi="Arial" w:cs="Arial"/>
-          <w:sz w:val="26"/>
-          <w:szCs w:val="26"/>
-        </w:rPr>
-        <w:t>- LastUpdatedDate</w:t>
-      </w:r>
+        <w:t xml:space="preserve">- </w:t>
+      </w:r>
+      <w:proofErr w:type="spellStart"/>
+      <w:r>
+        <w:rPr>
+          <w:rFonts w:ascii="Arial" w:eastAsia="Arial" w:hAnsi="Arial" w:cs="Arial"/>
+          <w:sz w:val="26"/>
+          <w:szCs w:val="26"/>
+        </w:rPr>
+        <w:t>PriorityLevel</w:t>
+      </w:r>
+      <w:proofErr w:type="spellEnd"/>
+      <w:r>
+        <w:rPr>
+          <w:rFonts w:ascii="Arial" w:eastAsia="Arial" w:hAnsi="Arial" w:cs="Arial"/>
+          <w:sz w:val="26"/>
+          <w:szCs w:val="26"/>
+        </w:rPr>
+        <w:t xml:space="preserve"> (Low, Medium, High)</w:t>
+      </w:r>
+    </w:p>
+    <w:p>
+      <w:pPr>
+        <w:rPr>
+          <w:rFonts w:ascii="Arial" w:eastAsia="Arial" w:hAnsi="Arial" w:cs="Arial"/>
+          <w:sz w:val="26"/>
+          <w:szCs w:val="26"/>
+        </w:rPr>
+      </w:pPr>
+      <w:r>
+        <w:rPr>
+          <w:rFonts w:ascii="Arial" w:eastAsia="Arial" w:hAnsi="Arial" w:cs="Arial"/>
+          <w:sz w:val="26"/>
+          <w:szCs w:val="26"/>
+        </w:rPr>
+        <w:t xml:space="preserve">- </w:t>
+      </w:r>
+      <w:proofErr w:type="spellStart"/>
+      <w:r>
+        <w:rPr>
+          <w:rFonts w:ascii="Arial" w:eastAsia="Arial" w:hAnsi="Arial" w:cs="Arial"/>
+          <w:sz w:val="26"/>
+          <w:szCs w:val="26"/>
+        </w:rPr>
+        <w:t>DueDate</w:t>
+      </w:r>
+      <w:proofErr w:type="spellEnd"/>
+      <w:r>
+        <w:rPr>
+          <w:rFonts w:ascii="Arial" w:eastAsia="Arial" w:hAnsi="Arial" w:cs="Arial"/>
+          <w:sz w:val="26"/>
+          <w:szCs w:val="26"/>
+        </w:rPr>
+        <w:t xml:space="preserve"> (optional)</w:t>
+      </w:r>
+    </w:p>
+    <w:p>
+      <w:pPr>
+        <w:rPr>
+          <w:rFonts w:ascii="Arial" w:eastAsia="Arial" w:hAnsi="Arial" w:cs="Arial"/>
+          <w:sz w:val="26"/>
+          <w:szCs w:val="26"/>
+        </w:rPr>
+      </w:pPr>
+      <w:r>
+        <w:rPr>
+          <w:rFonts w:ascii="Arial" w:eastAsia="Arial" w:hAnsi="Arial" w:cs="Arial"/>
+          <w:sz w:val="26"/>
+          <w:szCs w:val="26"/>
+        </w:rPr>
+        <w:t xml:space="preserve">- </w:t>
+      </w:r>
+      <w:proofErr w:type="spellStart"/>
+      <w:r>
+        <w:rPr>
+          <w:rFonts w:ascii="Arial" w:eastAsia="Arial" w:hAnsi="Arial" w:cs="Arial"/>
+          <w:sz w:val="26"/>
+          <w:szCs w:val="26"/>
+        </w:rPr>
+        <w:t>NextAction</w:t>
+      </w:r>
+      <w:proofErr w:type="spellEnd"/>
+      <w:r>
+        <w:rPr>
+          <w:rFonts w:ascii="Arial" w:eastAsia="Arial" w:hAnsi="Arial" w:cs="Arial"/>
+          <w:sz w:val="26"/>
+          <w:szCs w:val="26"/>
+        </w:rPr>
+        <w:t xml:space="preserve"> (optional)</w:t>
+      </w:r>
+    </w:p>
+    <w:p>
+      <w:pPr>
+        <w:rPr>
+          <w:rFonts w:ascii="Arial" w:eastAsia="Arial" w:hAnsi="Arial" w:cs="Arial"/>
+          <w:sz w:val="26"/>
+          <w:szCs w:val="26"/>
+        </w:rPr>
+      </w:pPr>
+      <w:r>
+        <w:rPr>
+          <w:rFonts w:ascii="Arial" w:eastAsia="Arial" w:hAnsi="Arial" w:cs="Arial"/>
+          <w:sz w:val="26"/>
+          <w:szCs w:val="26"/>
+        </w:rPr>
+        <w:t xml:space="preserve">- </w:t>
+      </w:r>
+      <w:proofErr w:type="spellStart"/>
+      <w:r>
+        <w:rPr>
+          <w:rFonts w:ascii="Arial" w:eastAsia="Arial" w:hAnsi="Arial" w:cs="Arial"/>
+          <w:sz w:val="26"/>
+          <w:szCs w:val="26"/>
+        </w:rPr>
+        <w:t>LastUpdatedDate</w:t>
+      </w:r>
+      <w:proofErr w:type="spellEnd"/>
     </w:p>
     <w:p>
       <w:pPr>
@@ -1649,24 +1751,60 @@
           <w:sz w:val="26"/>
           <w:szCs w:val="26"/>
         </w:rPr>
-        <w:t>- DueDate exists</w:t>
-      </w:r>
-    </w:p>
-    <w:p>
-      <w:pPr>
-        <w:rPr>
-          <w:rFonts w:ascii="Arial" w:eastAsia="Arial" w:hAnsi="Arial" w:cs="Arial"/>
-          <w:sz w:val="26"/>
-          <w:szCs w:val="26"/>
-        </w:rPr>
-      </w:pPr>
-      <w:r>
-        <w:rPr>
-          <w:rFonts w:ascii="Arial" w:eastAsia="Arial" w:hAnsi="Arial" w:cs="Arial"/>
-          <w:sz w:val="26"/>
-          <w:szCs w:val="26"/>
-        </w:rPr>
-        <w:t>- DueDate is earlier than the current date</w:t>
+        <w:t xml:space="preserve">- </w:t>
+      </w:r>
+      <w:proofErr w:type="spellStart"/>
+      <w:r>
+        <w:rPr>
+          <w:rFonts w:ascii="Arial" w:eastAsia="Arial" w:hAnsi="Arial" w:cs="Arial"/>
+          <w:sz w:val="26"/>
+          <w:szCs w:val="26"/>
+        </w:rPr>
+        <w:t>DueDate</w:t>
+      </w:r>
+      <w:proofErr w:type="spellEnd"/>
+      <w:r>
+        <w:rPr>
+          <w:rFonts w:ascii="Arial" w:eastAsia="Arial" w:hAnsi="Arial" w:cs="Arial"/>
+          <w:sz w:val="26"/>
+          <w:szCs w:val="26"/>
+        </w:rPr>
+        <w:t xml:space="preserve"> exists</w:t>
+      </w:r>
+    </w:p>
+    <w:p>
+      <w:pPr>
+        <w:rPr>
+          <w:rFonts w:ascii="Arial" w:eastAsia="Arial" w:hAnsi="Arial" w:cs="Arial"/>
+          <w:sz w:val="26"/>
+          <w:szCs w:val="26"/>
+        </w:rPr>
+      </w:pPr>
+      <w:r>
+        <w:rPr>
+          <w:rFonts w:ascii="Arial" w:eastAsia="Arial" w:hAnsi="Arial" w:cs="Arial"/>
+          <w:sz w:val="26"/>
+          <w:szCs w:val="26"/>
+        </w:rPr>
+        <w:t xml:space="preserve">- </w:t>
+      </w:r>
+      <w:proofErr w:type="spellStart"/>
+      <w:r>
+        <w:rPr>
+          <w:rFonts w:ascii="Arial" w:eastAsia="Arial" w:hAnsi="Arial" w:cs="Arial"/>
+          <w:sz w:val="26"/>
+          <w:szCs w:val="26"/>
+        </w:rPr>
+        <w:t>DueDate</w:t>
+      </w:r>
+      <w:proofErr w:type="spellEnd"/>
+      <w:r>
+        <w:rPr>
+          <w:rFonts w:ascii="Arial" w:eastAsia="Arial" w:hAnsi="Arial" w:cs="Arial"/>
+          <w:sz w:val="26"/>
+          <w:szCs w:val="26"/>
+        </w:rPr>
+        <w:t xml:space="preserve"> is earlier than the current date</w:t>
       </w:r>
     </w:p>
     <w:p>
@@ -1796,42 +1934,80 @@
           <w:sz w:val="26"/>
           <w:szCs w:val="26"/>
         </w:rPr>
-        <w:t>Each ProgressLogEntry includes:</w:t>
-      </w:r>
-    </w:p>
-    <w:p>
-      <w:pPr>
-        <w:rPr>
-          <w:rFonts w:ascii="Arial" w:eastAsia="Arial" w:hAnsi="Arial" w:cs="Arial"/>
-          <w:sz w:val="26"/>
-          <w:szCs w:val="26"/>
-        </w:rPr>
-      </w:pPr>
-      <w:r>
-        <w:rPr>
-          <w:rFonts w:ascii="Arial" w:eastAsia="Arial" w:hAnsi="Arial" w:cs="Arial"/>
-          <w:sz w:val="26"/>
-          <w:szCs w:val="26"/>
-        </w:rPr>
-        <w:t>- EntryText</w:t>
-      </w:r>
-    </w:p>
-    <w:p>
-      <w:pPr>
-        <w:rPr>
-          <w:rFonts w:ascii="Arial" w:eastAsia="Arial" w:hAnsi="Arial" w:cs="Arial"/>
-          <w:sz w:val="26"/>
-          <w:szCs w:val="26"/>
-        </w:rPr>
-      </w:pPr>
-      <w:r>
-        <w:rPr>
-          <w:rFonts w:ascii="Arial" w:eastAsia="Arial" w:hAnsi="Arial" w:cs="Arial"/>
-          <w:sz w:val="26"/>
-          <w:szCs w:val="26"/>
-        </w:rPr>
-        <w:t>- CreatedDate</w:t>
-      </w:r>
+        <w:t xml:space="preserve">Each </w:t>
+      </w:r>
+      <w:proofErr w:type="spellStart"/>
+      <w:r>
+        <w:rPr>
+          <w:rFonts w:ascii="Arial" w:eastAsia="Arial" w:hAnsi="Arial" w:cs="Arial"/>
+          <w:sz w:val="26"/>
+          <w:szCs w:val="26"/>
+        </w:rPr>
+        <w:t>ProgressLogEntry</w:t>
+      </w:r>
+      <w:proofErr w:type="spellEnd"/>
+      <w:r>
+        <w:rPr>
+          <w:rFonts w:ascii="Arial" w:eastAsia="Arial" w:hAnsi="Arial" w:cs="Arial"/>
+          <w:sz w:val="26"/>
+          <w:szCs w:val="26"/>
+        </w:rPr>
+        <w:t xml:space="preserve"> includes:</w:t>
+      </w:r>
+    </w:p>
+    <w:p>
+      <w:pPr>
+        <w:rPr>
+          <w:rFonts w:ascii="Arial" w:eastAsia="Arial" w:hAnsi="Arial" w:cs="Arial"/>
+          <w:sz w:val="26"/>
+          <w:szCs w:val="26"/>
+        </w:rPr>
+      </w:pPr>
+      <w:r>
+        <w:rPr>
+          <w:rFonts w:ascii="Arial" w:eastAsia="Arial" w:hAnsi="Arial" w:cs="Arial"/>
+          <w:sz w:val="26"/>
+          <w:szCs w:val="26"/>
+        </w:rPr>
+        <w:t xml:space="preserve">- </w:t>
+      </w:r>
+      <w:proofErr w:type="spellStart"/>
+      <w:r>
+        <w:rPr>
+          <w:rFonts w:ascii="Arial" w:eastAsia="Arial" w:hAnsi="Arial" w:cs="Arial"/>
+          <w:sz w:val="26"/>
+          <w:szCs w:val="26"/>
+        </w:rPr>
+        <w:t>EntryText</w:t>
+      </w:r>
+      <w:proofErr w:type="spellEnd"/>
+    </w:p>
+    <w:p>
+      <w:pPr>
+        <w:rPr>
+          <w:rFonts w:ascii="Arial" w:eastAsia="Arial" w:hAnsi="Arial" w:cs="Arial"/>
+          <w:sz w:val="26"/>
+          <w:szCs w:val="26"/>
+        </w:rPr>
+      </w:pPr>
+      <w:r>
+        <w:rPr>
+          <w:rFonts w:ascii="Arial" w:eastAsia="Arial" w:hAnsi="Arial" w:cs="Arial"/>
+          <w:sz w:val="26"/>
+          <w:szCs w:val="26"/>
+        </w:rPr>
+        <w:t xml:space="preserve">- </w:t>
+      </w:r>
+      <w:proofErr w:type="spellStart"/>
+      <w:r>
+        <w:rPr>
+          <w:rFonts w:ascii="Arial" w:eastAsia="Arial" w:hAnsi="Arial" w:cs="Arial"/>
+          <w:sz w:val="26"/>
+          <w:szCs w:val="26"/>
+        </w:rPr>
+        <w:t>CreatedDate</w:t>
+      </w:r>
+      <w:proofErr w:type="spellEnd"/>
     </w:p>
     <w:p>
       <w:pPr>
@@ -1933,85 +2109,141 @@
           <w:sz w:val="26"/>
           <w:szCs w:val="26"/>
         </w:rPr>
-        <w:t>5.7 NextAction</w:t>
-      </w:r>
-    </w:p>
-    <w:p>
-      <w:pPr>
-        <w:rPr>
-          <w:rFonts w:ascii="Arial" w:eastAsia="Arial" w:hAnsi="Arial" w:cs="Arial"/>
-          <w:sz w:val="26"/>
-          <w:szCs w:val="26"/>
-        </w:rPr>
-      </w:pPr>
-    </w:p>
-    <w:p>
-      <w:pPr>
-        <w:rPr>
-          <w:rFonts w:ascii="Arial" w:eastAsia="Arial" w:hAnsi="Arial" w:cs="Arial"/>
-          <w:sz w:val="26"/>
-          <w:szCs w:val="26"/>
-        </w:rPr>
-      </w:pPr>
-      <w:r>
-        <w:rPr>
-          <w:rFonts w:ascii="Arial" w:eastAsia="Arial" w:hAnsi="Arial" w:cs="Arial"/>
-          <w:sz w:val="26"/>
-          <w:szCs w:val="26"/>
-        </w:rPr>
-        <w:t>Users may assign a NextAction to a task.</w:t>
-      </w:r>
-    </w:p>
-    <w:p>
-      <w:pPr>
-        <w:rPr>
-          <w:rFonts w:ascii="Arial" w:eastAsia="Arial" w:hAnsi="Arial" w:cs="Arial"/>
-          <w:sz w:val="26"/>
-          <w:szCs w:val="26"/>
-        </w:rPr>
-      </w:pPr>
-    </w:p>
-    <w:p>
-      <w:pPr>
-        <w:rPr>
-          <w:rFonts w:ascii="Arial" w:eastAsia="Arial" w:hAnsi="Arial" w:cs="Arial"/>
-          <w:sz w:val="26"/>
-          <w:szCs w:val="26"/>
-        </w:rPr>
-      </w:pPr>
-      <w:r>
-        <w:rPr>
-          <w:rFonts w:ascii="Arial" w:eastAsia="Arial" w:hAnsi="Arial" w:cs="Arial"/>
-          <w:sz w:val="26"/>
-          <w:szCs w:val="26"/>
-        </w:rPr>
-        <w:t>NextAction is a short description of the next concrete step needed to move the task forward.</w:t>
-      </w:r>
-    </w:p>
-    <w:p>
-      <w:pPr>
-        <w:rPr>
-          <w:rFonts w:ascii="Arial" w:eastAsia="Arial" w:hAnsi="Arial" w:cs="Arial"/>
-          <w:sz w:val="26"/>
-          <w:szCs w:val="26"/>
-        </w:rPr>
-      </w:pPr>
-    </w:p>
-    <w:p>
-      <w:pPr>
-        <w:rPr>
-          <w:rFonts w:ascii="Arial" w:eastAsia="Arial" w:hAnsi="Arial" w:cs="Arial"/>
-          <w:sz w:val="26"/>
-          <w:szCs w:val="26"/>
-        </w:rPr>
-      </w:pPr>
-      <w:r>
-        <w:rPr>
-          <w:rFonts w:ascii="Arial" w:eastAsia="Arial" w:hAnsi="Arial" w:cs="Arial"/>
-          <w:sz w:val="26"/>
-          <w:szCs w:val="26"/>
-        </w:rPr>
-        <w:t>The system displays NextAction with the task to reduce friction when returning to unfinished work.</w:t>
+        <w:t xml:space="preserve">5.7 </w:t>
+      </w:r>
+      <w:proofErr w:type="spellStart"/>
+      <w:r>
+        <w:rPr>
+          <w:rFonts w:ascii="Arial" w:eastAsia="Arial" w:hAnsi="Arial" w:cs="Arial"/>
+          <w:sz w:val="26"/>
+          <w:szCs w:val="26"/>
+        </w:rPr>
+        <w:t>NextAction</w:t>
+      </w:r>
+      <w:proofErr w:type="spellEnd"/>
+    </w:p>
+    <w:p>
+      <w:pPr>
+        <w:rPr>
+          <w:rFonts w:ascii="Arial" w:eastAsia="Arial" w:hAnsi="Arial" w:cs="Arial"/>
+          <w:sz w:val="26"/>
+          <w:szCs w:val="26"/>
+        </w:rPr>
+      </w:pPr>
+    </w:p>
+    <w:p>
+      <w:pPr>
+        <w:rPr>
+          <w:rFonts w:ascii="Arial" w:eastAsia="Arial" w:hAnsi="Arial" w:cs="Arial"/>
+          <w:sz w:val="26"/>
+          <w:szCs w:val="26"/>
+        </w:rPr>
+      </w:pPr>
+      <w:r>
+        <w:rPr>
+          <w:rFonts w:ascii="Arial" w:eastAsia="Arial" w:hAnsi="Arial" w:cs="Arial"/>
+          <w:sz w:val="26"/>
+          <w:szCs w:val="26"/>
+        </w:rPr>
+        <w:t xml:space="preserve">Users may assign a </w:t>
+      </w:r>
+      <w:proofErr w:type="spellStart"/>
+      <w:r>
+        <w:rPr>
+          <w:rFonts w:ascii="Arial" w:eastAsia="Arial" w:hAnsi="Arial" w:cs="Arial"/>
+          <w:sz w:val="26"/>
+          <w:szCs w:val="26"/>
+        </w:rPr>
+        <w:t>NextAction</w:t>
+      </w:r>
+      <w:proofErr w:type="spellEnd"/>
+      <w:r>
+        <w:rPr>
+          <w:rFonts w:ascii="Arial" w:eastAsia="Arial" w:hAnsi="Arial" w:cs="Arial"/>
+          <w:sz w:val="26"/>
+          <w:szCs w:val="26"/>
+        </w:rPr>
+        <w:t xml:space="preserve"> to a task.</w:t>
+      </w:r>
+    </w:p>
+    <w:p>
+      <w:pPr>
+        <w:rPr>
+          <w:rFonts w:ascii="Arial" w:eastAsia="Arial" w:hAnsi="Arial" w:cs="Arial"/>
+          <w:sz w:val="26"/>
+          <w:szCs w:val="26"/>
+        </w:rPr>
+      </w:pPr>
+    </w:p>
+    <w:p>
+      <w:pPr>
+        <w:rPr>
+          <w:rFonts w:ascii="Arial" w:eastAsia="Arial" w:hAnsi="Arial" w:cs="Arial"/>
+          <w:sz w:val="26"/>
+          <w:szCs w:val="26"/>
+        </w:rPr>
+      </w:pPr>
+      <w:proofErr w:type="spellStart"/>
+      <w:r>
+        <w:rPr>
+          <w:rFonts w:ascii="Arial" w:eastAsia="Arial" w:hAnsi="Arial" w:cs="Arial"/>
+          <w:sz w:val="26"/>
+          <w:szCs w:val="26"/>
+        </w:rPr>
+        <w:t>NextAction</w:t>
+      </w:r>
+      <w:proofErr w:type="spellEnd"/>
+      <w:r>
+        <w:rPr>
+          <w:rFonts w:ascii="Arial" w:eastAsia="Arial" w:hAnsi="Arial" w:cs="Arial"/>
+          <w:sz w:val="26"/>
+          <w:szCs w:val="26"/>
+        </w:rPr>
+        <w:t xml:space="preserve"> is a short description of the next concrete step needed to move the task forward.</w:t>
+      </w:r>
+    </w:p>
+    <w:p>
+      <w:pPr>
+        <w:rPr>
+          <w:rFonts w:ascii="Arial" w:eastAsia="Arial" w:hAnsi="Arial" w:cs="Arial"/>
+          <w:sz w:val="26"/>
+          <w:szCs w:val="26"/>
+        </w:rPr>
+      </w:pPr>
+    </w:p>
+    <w:p>
+      <w:pPr>
+        <w:rPr>
+          <w:rFonts w:ascii="Arial" w:eastAsia="Arial" w:hAnsi="Arial" w:cs="Arial"/>
+          <w:sz w:val="26"/>
+          <w:szCs w:val="26"/>
+        </w:rPr>
+      </w:pPr>
+      <w:r>
+        <w:rPr>
+          <w:rFonts w:ascii="Arial" w:eastAsia="Arial" w:hAnsi="Arial" w:cs="Arial"/>
+          <w:sz w:val="26"/>
+          <w:szCs w:val="26"/>
+        </w:rPr>
+        <w:t xml:space="preserve">The system displays </w:t>
+      </w:r>
+      <w:proofErr w:type="spellStart"/>
+      <w:r>
+        <w:rPr>
+          <w:rFonts w:ascii="Arial" w:eastAsia="Arial" w:hAnsi="Arial" w:cs="Arial"/>
+          <w:sz w:val="26"/>
+          <w:szCs w:val="26"/>
+        </w:rPr>
+        <w:t>NextAction</w:t>
+      </w:r>
+      <w:proofErr w:type="spellEnd"/>
+      <w:r>
+        <w:rPr>
+          <w:rFonts w:ascii="Arial" w:eastAsia="Arial" w:hAnsi="Arial" w:cs="Arial"/>
+          <w:sz w:val="26"/>
+          <w:szCs w:val="26"/>
+        </w:rPr>
+        <w:t xml:space="preserve"> with the task to reduce friction when returning to unfinished work.</w:t>
       </w:r>
     </w:p>
     <w:p>
@@ -2191,7 +2423,25 @@
           <w:sz w:val="26"/>
           <w:szCs w:val="26"/>
         </w:rPr>
-        <w:t>- NextAction clearly visible</w:t>
+        <w:t xml:space="preserve">- </w:t>
+      </w:r>
+      <w:proofErr w:type="spellStart"/>
+      <w:r>
+        <w:rPr>
+          <w:rFonts w:ascii="Arial" w:eastAsia="Arial" w:hAnsi="Arial" w:cs="Arial"/>
+          <w:sz w:val="26"/>
+          <w:szCs w:val="26"/>
+        </w:rPr>
+        <w:t>NextAction</w:t>
+      </w:r>
+      <w:proofErr w:type="spellEnd"/>
+      <w:r>
+        <w:rPr>
+          <w:rFonts w:ascii="Arial" w:eastAsia="Arial" w:hAnsi="Arial" w:cs="Arial"/>
+          <w:sz w:val="26"/>
+          <w:szCs w:val="26"/>
+        </w:rPr>
+        <w:t xml:space="preserve"> clearly visible</w:t>
       </w:r>
     </w:p>
     <w:p>
@@ -2423,8 +2673,18 @@
           <w:sz w:val="26"/>
           <w:szCs w:val="26"/>
         </w:rPr>
-        <w:t>- UserId</w:t>
-      </w:r>
+        <w:t xml:space="preserve">- </w:t>
+      </w:r>
+      <w:proofErr w:type="spellStart"/>
+      <w:r>
+        <w:rPr>
+          <w:rFonts w:ascii="Arial" w:eastAsia="Arial" w:hAnsi="Arial" w:cs="Arial"/>
+          <w:sz w:val="26"/>
+          <w:szCs w:val="26"/>
+        </w:rPr>
+        <w:t>UserId</w:t>
+      </w:r>
+      <w:proofErr w:type="spellEnd"/>
     </w:p>
     <w:p>
       <w:pPr>
@@ -2457,8 +2717,18 @@
           <w:sz w:val="26"/>
           <w:szCs w:val="26"/>
         </w:rPr>
-        <w:t>- PasswordHash</w:t>
-      </w:r>
+        <w:t xml:space="preserve">- </w:t>
+      </w:r>
+      <w:proofErr w:type="spellStart"/>
+      <w:r>
+        <w:rPr>
+          <w:rFonts w:ascii="Arial" w:eastAsia="Arial" w:hAnsi="Arial" w:cs="Arial"/>
+          <w:sz w:val="26"/>
+          <w:szCs w:val="26"/>
+        </w:rPr>
+        <w:t>PasswordHash</w:t>
+      </w:r>
+      <w:proofErr w:type="spellEnd"/>
     </w:p>
     <w:p>
       <w:pPr>
@@ -2500,24 +2770,52 @@
           <w:sz w:val="26"/>
           <w:szCs w:val="26"/>
         </w:rPr>
-        <w:t>- TaskId</w:t>
-      </w:r>
-    </w:p>
-    <w:p>
-      <w:pPr>
-        <w:rPr>
-          <w:rFonts w:ascii="Arial" w:eastAsia="Arial" w:hAnsi="Arial" w:cs="Arial"/>
-          <w:sz w:val="26"/>
-          <w:szCs w:val="26"/>
-        </w:rPr>
-      </w:pPr>
-      <w:r>
-        <w:rPr>
-          <w:rFonts w:ascii="Arial" w:eastAsia="Arial" w:hAnsi="Arial" w:cs="Arial"/>
-          <w:sz w:val="26"/>
-          <w:szCs w:val="26"/>
-        </w:rPr>
-        <w:t>- UserId (FK)</w:t>
+        <w:t xml:space="preserve">- </w:t>
+      </w:r>
+      <w:proofErr w:type="spellStart"/>
+      <w:r>
+        <w:rPr>
+          <w:rFonts w:ascii="Arial" w:eastAsia="Arial" w:hAnsi="Arial" w:cs="Arial"/>
+          <w:sz w:val="26"/>
+          <w:szCs w:val="26"/>
+        </w:rPr>
+        <w:t>TaskId</w:t>
+      </w:r>
+      <w:proofErr w:type="spellEnd"/>
+    </w:p>
+    <w:p>
+      <w:pPr>
+        <w:rPr>
+          <w:rFonts w:ascii="Arial" w:eastAsia="Arial" w:hAnsi="Arial" w:cs="Arial"/>
+          <w:sz w:val="26"/>
+          <w:szCs w:val="26"/>
+        </w:rPr>
+      </w:pPr>
+      <w:r>
+        <w:rPr>
+          <w:rFonts w:ascii="Arial" w:eastAsia="Arial" w:hAnsi="Arial" w:cs="Arial"/>
+          <w:sz w:val="26"/>
+          <w:szCs w:val="26"/>
+        </w:rPr>
+        <w:t xml:space="preserve">- </w:t>
+      </w:r>
+      <w:proofErr w:type="spellStart"/>
+      <w:r>
+        <w:rPr>
+          <w:rFonts w:ascii="Arial" w:eastAsia="Arial" w:hAnsi="Arial" w:cs="Arial"/>
+          <w:sz w:val="26"/>
+          <w:szCs w:val="26"/>
+        </w:rPr>
+        <w:t>UserId</w:t>
+      </w:r>
+      <w:proofErr w:type="spellEnd"/>
+      <w:r>
+        <w:rPr>
+          <w:rFonts w:ascii="Arial" w:eastAsia="Arial" w:hAnsi="Arial" w:cs="Arial"/>
+          <w:sz w:val="26"/>
+          <w:szCs w:val="26"/>
+        </w:rPr>
+        <w:t xml:space="preserve"> (FK)</w:t>
       </w:r>
     </w:p>
     <w:p>
@@ -2585,25 +2883,45 @@
           <w:sz w:val="26"/>
           <w:szCs w:val="26"/>
         </w:rPr>
-        <w:t>- PriorityLevel</w:t>
-      </w:r>
-    </w:p>
-    <w:p>
-      <w:pPr>
-        <w:rPr>
-          <w:rFonts w:ascii="Arial" w:eastAsia="Arial" w:hAnsi="Arial" w:cs="Arial"/>
-          <w:sz w:val="26"/>
-          <w:szCs w:val="26"/>
-        </w:rPr>
-      </w:pPr>
-      <w:r>
-        <w:rPr>
-          <w:rFonts w:ascii="Arial" w:eastAsia="Arial" w:hAnsi="Arial" w:cs="Arial"/>
-          <w:sz w:val="26"/>
-          <w:szCs w:val="26"/>
-        </w:rPr>
-        <w:t>- DueDate</w:t>
-      </w:r>
+        <w:t xml:space="preserve">- </w:t>
+      </w:r>
+      <w:proofErr w:type="spellStart"/>
+      <w:r>
+        <w:rPr>
+          <w:rFonts w:ascii="Arial" w:eastAsia="Arial" w:hAnsi="Arial" w:cs="Arial"/>
+          <w:sz w:val="26"/>
+          <w:szCs w:val="26"/>
+        </w:rPr>
+        <w:t>PriorityLevel</w:t>
+      </w:r>
+      <w:proofErr w:type="spellEnd"/>
+    </w:p>
+    <w:p>
+      <w:pPr>
+        <w:rPr>
+          <w:rFonts w:ascii="Arial" w:eastAsia="Arial" w:hAnsi="Arial" w:cs="Arial"/>
+          <w:sz w:val="26"/>
+          <w:szCs w:val="26"/>
+        </w:rPr>
+      </w:pPr>
+      <w:r>
+        <w:rPr>
+          <w:rFonts w:ascii="Arial" w:eastAsia="Arial" w:hAnsi="Arial" w:cs="Arial"/>
+          <w:sz w:val="26"/>
+          <w:szCs w:val="26"/>
+        </w:rPr>
+        <w:t xml:space="preserve">- </w:t>
+      </w:r>
+      <w:proofErr w:type="spellStart"/>
+      <w:r>
+        <w:rPr>
+          <w:rFonts w:ascii="Arial" w:eastAsia="Arial" w:hAnsi="Arial" w:cs="Arial"/>
+          <w:sz w:val="26"/>
+          <w:szCs w:val="26"/>
+        </w:rPr>
+        <w:t>DueDate</w:t>
+      </w:r>
+      <w:proofErr w:type="spellEnd"/>
     </w:p>
     <w:p>
       <w:pPr>
@@ -2620,43 +2938,64 @@
           <w:szCs w:val="26"/>
         </w:rPr>
         <w:lastRenderedPageBreak/>
-        <w:t>- NextAction</w:t>
-      </w:r>
-    </w:p>
-    <w:p>
-      <w:pPr>
-        <w:rPr>
-          <w:rFonts w:ascii="Arial" w:eastAsia="Arial" w:hAnsi="Arial" w:cs="Arial"/>
-          <w:sz w:val="26"/>
-          <w:szCs w:val="26"/>
-        </w:rPr>
-      </w:pPr>
-      <w:r>
-        <w:rPr>
-          <w:rFonts w:ascii="Arial" w:eastAsia="Arial" w:hAnsi="Arial" w:cs="Arial"/>
-          <w:sz w:val="26"/>
-          <w:szCs w:val="26"/>
-        </w:rPr>
-        <w:t>- LastUpdatedDate</w:t>
-      </w:r>
-    </w:p>
-    <w:p>
-      <w:pPr>
-        <w:rPr>
-          <w:rFonts w:ascii="Arial" w:eastAsia="Arial" w:hAnsi="Arial" w:cs="Arial"/>
-          <w:sz w:val="26"/>
-          <w:szCs w:val="26"/>
-        </w:rPr>
-      </w:pPr>
-    </w:p>
-    <w:p>
-      <w:pPr>
-        <w:rPr>
-          <w:rFonts w:ascii="Arial" w:eastAsia="Arial" w:hAnsi="Arial" w:cs="Arial"/>
-          <w:sz w:val="26"/>
-          <w:szCs w:val="26"/>
-        </w:rPr>
-      </w:pPr>
+        <w:t xml:space="preserve">- </w:t>
+      </w:r>
+      <w:proofErr w:type="spellStart"/>
+      <w:r>
+        <w:rPr>
+          <w:rFonts w:ascii="Arial" w:eastAsia="Arial" w:hAnsi="Arial" w:cs="Arial"/>
+          <w:sz w:val="26"/>
+          <w:szCs w:val="26"/>
+        </w:rPr>
+        <w:t>NextAction</w:t>
+      </w:r>
+      <w:proofErr w:type="spellEnd"/>
+    </w:p>
+    <w:p>
+      <w:pPr>
+        <w:rPr>
+          <w:rFonts w:ascii="Arial" w:eastAsia="Arial" w:hAnsi="Arial" w:cs="Arial"/>
+          <w:sz w:val="26"/>
+          <w:szCs w:val="26"/>
+        </w:rPr>
+      </w:pPr>
+      <w:r>
+        <w:rPr>
+          <w:rFonts w:ascii="Arial" w:eastAsia="Arial" w:hAnsi="Arial" w:cs="Arial"/>
+          <w:sz w:val="26"/>
+          <w:szCs w:val="26"/>
+        </w:rPr>
+        <w:t xml:space="preserve">- </w:t>
+      </w:r>
+      <w:proofErr w:type="spellStart"/>
+      <w:r>
+        <w:rPr>
+          <w:rFonts w:ascii="Arial" w:eastAsia="Arial" w:hAnsi="Arial" w:cs="Arial"/>
+          <w:sz w:val="26"/>
+          <w:szCs w:val="26"/>
+        </w:rPr>
+        <w:t>LastUpdatedDate</w:t>
+      </w:r>
+      <w:proofErr w:type="spellEnd"/>
+    </w:p>
+    <w:p>
+      <w:pPr>
+        <w:rPr>
+          <w:rFonts w:ascii="Arial" w:eastAsia="Arial" w:hAnsi="Arial" w:cs="Arial"/>
+          <w:sz w:val="26"/>
+          <w:szCs w:val="26"/>
+        </w:rPr>
+      </w:pPr>
+    </w:p>
+    <w:p>
+      <w:pPr>
+        <w:rPr>
+          <w:rFonts w:ascii="Arial" w:eastAsia="Arial" w:hAnsi="Arial" w:cs="Arial"/>
+          <w:sz w:val="26"/>
+          <w:szCs w:val="26"/>
+        </w:rPr>
+      </w:pPr>
+      <w:proofErr w:type="spellStart"/>
       <w:r>
         <w:rPr>
           <w:rFonts w:ascii="Arial" w:eastAsia="Arial" w:hAnsi="Arial" w:cs="Arial"/>
@@ -2665,74 +3004,123 @@
         </w:rPr>
         <w:t>ProgressLogEntry</w:t>
       </w:r>
-    </w:p>
-    <w:p>
-      <w:pPr>
-        <w:rPr>
-          <w:rFonts w:ascii="Arial" w:eastAsia="Arial" w:hAnsi="Arial" w:cs="Arial"/>
-          <w:sz w:val="26"/>
-          <w:szCs w:val="26"/>
-        </w:rPr>
-      </w:pPr>
-      <w:r>
-        <w:rPr>
-          <w:rFonts w:ascii="Arial" w:eastAsia="Arial" w:hAnsi="Arial" w:cs="Arial"/>
-          <w:sz w:val="26"/>
-          <w:szCs w:val="26"/>
-        </w:rPr>
-        <w:t>- ProgressLogEntryId</w:t>
-      </w:r>
-    </w:p>
-    <w:p>
-      <w:pPr>
-        <w:rPr>
-          <w:rFonts w:ascii="Arial" w:eastAsia="Arial" w:hAnsi="Arial" w:cs="Arial"/>
-          <w:sz w:val="26"/>
-          <w:szCs w:val="26"/>
-        </w:rPr>
-      </w:pPr>
-      <w:r>
-        <w:rPr>
-          <w:rFonts w:ascii="Arial" w:eastAsia="Arial" w:hAnsi="Arial" w:cs="Arial"/>
-          <w:sz w:val="26"/>
-          <w:szCs w:val="26"/>
-        </w:rPr>
-        <w:t>- TaskId (FK)</w:t>
-      </w:r>
-    </w:p>
-    <w:p>
-      <w:pPr>
-        <w:rPr>
-          <w:rFonts w:ascii="Arial" w:eastAsia="Arial" w:hAnsi="Arial" w:cs="Arial"/>
-          <w:sz w:val="26"/>
-          <w:szCs w:val="26"/>
-        </w:rPr>
-      </w:pPr>
-      <w:r>
-        <w:rPr>
-          <w:rFonts w:ascii="Arial" w:eastAsia="Arial" w:hAnsi="Arial" w:cs="Arial"/>
-          <w:sz w:val="26"/>
-          <w:szCs w:val="26"/>
-        </w:rPr>
-        <w:t>- EntryText</w:t>
-      </w:r>
-    </w:p>
-    <w:p>
-      <w:pPr>
-        <w:rPr>
-          <w:rFonts w:ascii="Arial" w:eastAsia="Arial" w:hAnsi="Arial" w:cs="Arial"/>
-          <w:sz w:val="26"/>
-          <w:szCs w:val="26"/>
-        </w:rPr>
-      </w:pPr>
-      <w:r>
-        <w:rPr>
-          <w:rFonts w:ascii="Arial" w:eastAsia="Arial" w:hAnsi="Arial" w:cs="Arial"/>
-          <w:sz w:val="26"/>
-          <w:szCs w:val="26"/>
-        </w:rPr>
-        <w:t>- CreatedDate</w:t>
-      </w:r>
+      <w:proofErr w:type="spellEnd"/>
+    </w:p>
+    <w:p>
+      <w:pPr>
+        <w:rPr>
+          <w:rFonts w:ascii="Arial" w:eastAsia="Arial" w:hAnsi="Arial" w:cs="Arial"/>
+          <w:sz w:val="26"/>
+          <w:szCs w:val="26"/>
+        </w:rPr>
+      </w:pPr>
+      <w:r>
+        <w:rPr>
+          <w:rFonts w:ascii="Arial" w:eastAsia="Arial" w:hAnsi="Arial" w:cs="Arial"/>
+          <w:sz w:val="26"/>
+          <w:szCs w:val="26"/>
+        </w:rPr>
+        <w:t xml:space="preserve">- </w:t>
+      </w:r>
+      <w:proofErr w:type="spellStart"/>
+      <w:r>
+        <w:rPr>
+          <w:rFonts w:ascii="Arial" w:eastAsia="Arial" w:hAnsi="Arial" w:cs="Arial"/>
+          <w:sz w:val="26"/>
+          <w:szCs w:val="26"/>
+        </w:rPr>
+        <w:t>ProgressLogEntryId</w:t>
+      </w:r>
+      <w:proofErr w:type="spellEnd"/>
+    </w:p>
+    <w:p>
+      <w:pPr>
+        <w:rPr>
+          <w:rFonts w:ascii="Arial" w:eastAsia="Arial" w:hAnsi="Arial" w:cs="Arial"/>
+          <w:sz w:val="26"/>
+          <w:szCs w:val="26"/>
+        </w:rPr>
+      </w:pPr>
+      <w:r>
+        <w:rPr>
+          <w:rFonts w:ascii="Arial" w:eastAsia="Arial" w:hAnsi="Arial" w:cs="Arial"/>
+          <w:sz w:val="26"/>
+          <w:szCs w:val="26"/>
+        </w:rPr>
+        <w:t xml:space="preserve">- </w:t>
+      </w:r>
+      <w:proofErr w:type="spellStart"/>
+      <w:r>
+        <w:rPr>
+          <w:rFonts w:ascii="Arial" w:eastAsia="Arial" w:hAnsi="Arial" w:cs="Arial"/>
+          <w:sz w:val="26"/>
+          <w:szCs w:val="26"/>
+        </w:rPr>
+        <w:t>TaskId</w:t>
+      </w:r>
+      <w:proofErr w:type="spellEnd"/>
+      <w:r>
+        <w:rPr>
+          <w:rFonts w:ascii="Arial" w:eastAsia="Arial" w:hAnsi="Arial" w:cs="Arial"/>
+          <w:sz w:val="26"/>
+          <w:szCs w:val="26"/>
+        </w:rPr>
+        <w:t xml:space="preserve"> (FK)</w:t>
+      </w:r>
+    </w:p>
+    <w:p>
+      <w:pPr>
+        <w:rPr>
+          <w:rFonts w:ascii="Arial" w:eastAsia="Arial" w:hAnsi="Arial" w:cs="Arial"/>
+          <w:sz w:val="26"/>
+          <w:szCs w:val="26"/>
+        </w:rPr>
+      </w:pPr>
+      <w:r>
+        <w:rPr>
+          <w:rFonts w:ascii="Arial" w:eastAsia="Arial" w:hAnsi="Arial" w:cs="Arial"/>
+          <w:sz w:val="26"/>
+          <w:szCs w:val="26"/>
+        </w:rPr>
+        <w:t xml:space="preserve">- </w:t>
+      </w:r>
+      <w:proofErr w:type="spellStart"/>
+      <w:r>
+        <w:rPr>
+          <w:rFonts w:ascii="Arial" w:eastAsia="Arial" w:hAnsi="Arial" w:cs="Arial"/>
+          <w:sz w:val="26"/>
+          <w:szCs w:val="26"/>
+        </w:rPr>
+        <w:t>EntryText</w:t>
+      </w:r>
+      <w:proofErr w:type="spellEnd"/>
+    </w:p>
+    <w:p>
+      <w:pPr>
+        <w:rPr>
+          <w:rFonts w:ascii="Arial" w:eastAsia="Arial" w:hAnsi="Arial" w:cs="Arial"/>
+          <w:sz w:val="26"/>
+          <w:szCs w:val="26"/>
+        </w:rPr>
+      </w:pPr>
+      <w:r>
+        <w:rPr>
+          <w:rFonts w:ascii="Arial" w:eastAsia="Arial" w:hAnsi="Arial" w:cs="Arial"/>
+          <w:sz w:val="26"/>
+          <w:szCs w:val="26"/>
+        </w:rPr>
+        <w:t xml:space="preserve">- </w:t>
+      </w:r>
+      <w:proofErr w:type="spellStart"/>
+      <w:r>
+        <w:rPr>
+          <w:rFonts w:ascii="Arial" w:eastAsia="Arial" w:hAnsi="Arial" w:cs="Arial"/>
+          <w:sz w:val="26"/>
+          <w:szCs w:val="26"/>
+        </w:rPr>
+        <w:t>CreatedDate</w:t>
+      </w:r>
+      <w:proofErr w:type="spellEnd"/>
     </w:p>
     <w:p>
       <w:pPr>
@@ -2923,13 +3311,23 @@
           <w:szCs w:val="26"/>
         </w:rPr>
       </w:pPr>
-      <w:r>
-        <w:rPr>
-          <w:rFonts w:ascii="Arial" w:eastAsia="Arial" w:hAnsi="Arial" w:cs="Arial"/>
-          <w:sz w:val="26"/>
-          <w:szCs w:val="26"/>
-        </w:rPr>
-        <w:t>NextAction Rule:</w:t>
+      <w:proofErr w:type="spellStart"/>
+      <w:r>
+        <w:rPr>
+          <w:rFonts w:ascii="Arial" w:eastAsia="Arial" w:hAnsi="Arial" w:cs="Arial"/>
+          <w:sz w:val="26"/>
+          <w:szCs w:val="26"/>
+        </w:rPr>
+        <w:t>NextAction</w:t>
+      </w:r>
+      <w:proofErr w:type="spellEnd"/>
+      <w:r>
+        <w:rPr>
+          <w:rFonts w:ascii="Arial" w:eastAsia="Arial" w:hAnsi="Arial" w:cs="Arial"/>
+          <w:sz w:val="26"/>
+          <w:szCs w:val="26"/>
+        </w:rPr>
+        <w:t xml:space="preserve"> Rule:</w:t>
       </w:r>
     </w:p>
     <w:p>
@@ -3078,13 +3476,23 @@
           <w:szCs w:val="26"/>
         </w:rPr>
       </w:pPr>
-      <w:r>
-        <w:rPr>
-          <w:rFonts w:ascii="Arial" w:eastAsia="Arial" w:hAnsi="Arial" w:cs="Arial"/>
-          <w:sz w:val="26"/>
-          <w:szCs w:val="26"/>
-        </w:rPr>
-        <w:t>LastUpdatedDate is updated when:</w:t>
+      <w:proofErr w:type="spellStart"/>
+      <w:r>
+        <w:rPr>
+          <w:rFonts w:ascii="Arial" w:eastAsia="Arial" w:hAnsi="Arial" w:cs="Arial"/>
+          <w:sz w:val="26"/>
+          <w:szCs w:val="26"/>
+        </w:rPr>
+        <w:t>LastUpdatedDate</w:t>
+      </w:r>
+      <w:proofErr w:type="spellEnd"/>
+      <w:r>
+        <w:rPr>
+          <w:rFonts w:ascii="Arial" w:eastAsia="Arial" w:hAnsi="Arial" w:cs="Arial"/>
+          <w:sz w:val="26"/>
+          <w:szCs w:val="26"/>
+        </w:rPr>
+        <w:t xml:space="preserve"> is updated when:</w:t>
       </w:r>
     </w:p>
     <w:p>
@@ -3152,7 +3560,25 @@
           <w:sz w:val="26"/>
           <w:szCs w:val="26"/>
         </w:rPr>
-        <w:t>- A ProgressLogEntry is added</w:t>
+        <w:t xml:space="preserve">- A </w:t>
+      </w:r>
+      <w:proofErr w:type="spellStart"/>
+      <w:r>
+        <w:rPr>
+          <w:rFonts w:ascii="Arial" w:eastAsia="Arial" w:hAnsi="Arial" w:cs="Arial"/>
+          <w:sz w:val="26"/>
+          <w:szCs w:val="26"/>
+        </w:rPr>
+        <w:t>ProgressLogEntry</w:t>
+      </w:r>
+      <w:proofErr w:type="spellEnd"/>
+      <w:r>
+        <w:rPr>
+          <w:rFonts w:ascii="Arial" w:eastAsia="Arial" w:hAnsi="Arial" w:cs="Arial"/>
+          <w:sz w:val="26"/>
+          <w:szCs w:val="26"/>
+        </w:rPr>
+        <w:t xml:space="preserve"> is added</w:t>
       </w:r>
     </w:p>
     <w:p>
@@ -3633,7 +4059,25 @@
           <w:sz w:val="26"/>
           <w:szCs w:val="26"/>
         </w:rPr>
-        <w:t>User creates a new task by entering a title, description, and optional fields such as due date, priority level, and NextAction.</w:t>
+        <w:t xml:space="preserve">User creates a new task by entering a title, description, and optional fields such as due date, priority level, and </w:t>
+      </w:r>
+      <w:proofErr w:type="spellStart"/>
+      <w:r>
+        <w:rPr>
+          <w:rFonts w:ascii="Arial" w:eastAsia="Arial" w:hAnsi="Arial" w:cs="Arial"/>
+          <w:sz w:val="26"/>
+          <w:szCs w:val="26"/>
+        </w:rPr>
+        <w:t>NextAction</w:t>
+      </w:r>
+      <w:proofErr w:type="spellEnd"/>
+      <w:r>
+        <w:rPr>
+          <w:rFonts w:ascii="Arial" w:eastAsia="Arial" w:hAnsi="Arial" w:cs="Arial"/>
+          <w:sz w:val="26"/>
+          <w:szCs w:val="26"/>
+        </w:rPr>
+        <w:t>.</w:t>
       </w:r>
     </w:p>
     <w:p>
@@ -4020,7 +4464,25 @@
           <w:sz w:val="26"/>
           <w:szCs w:val="26"/>
         </w:rPr>
-        <w:t>User adds a ProgressLogEntry to record work or context.</w:t>
+        <w:t xml:space="preserve">User adds a </w:t>
+      </w:r>
+      <w:proofErr w:type="spellStart"/>
+      <w:r>
+        <w:rPr>
+          <w:rFonts w:ascii="Arial" w:eastAsia="Arial" w:hAnsi="Arial" w:cs="Arial"/>
+          <w:sz w:val="26"/>
+          <w:szCs w:val="26"/>
+        </w:rPr>
+        <w:t>ProgressLogEntry</w:t>
+      </w:r>
+      <w:proofErr w:type="spellEnd"/>
+      <w:r>
+        <w:rPr>
+          <w:rFonts w:ascii="Arial" w:eastAsia="Arial" w:hAnsi="Arial" w:cs="Arial"/>
+          <w:sz w:val="26"/>
+          <w:szCs w:val="26"/>
+        </w:rPr>
+        <w:t xml:space="preserve"> to record work or context.</w:t>
       </w:r>
     </w:p>
     <w:p>
@@ -4063,34 +4525,62 @@
           <w:sz w:val="26"/>
           <w:szCs w:val="26"/>
         </w:rPr>
-        <w:t>User views ProgressLogEntry history for a task.</w:t>
-      </w:r>
-    </w:p>
-    <w:p>
-      <w:pPr>
-        <w:rPr>
-          <w:rFonts w:ascii="Arial" w:eastAsia="Arial" w:hAnsi="Arial" w:cs="Arial"/>
-          <w:sz w:val="26"/>
-          <w:szCs w:val="26"/>
-        </w:rPr>
-      </w:pPr>
-    </w:p>
-    <w:p>
-      <w:pPr>
-        <w:rPr>
-          <w:rFonts w:ascii="Arial" w:eastAsia="Arial" w:hAnsi="Arial" w:cs="Arial"/>
-          <w:sz w:val="26"/>
-          <w:szCs w:val="26"/>
-        </w:rPr>
-      </w:pPr>
-      <w:r>
-        <w:rPr>
-          <w:rFonts w:ascii="Arial" w:eastAsia="Arial" w:hAnsi="Arial" w:cs="Arial"/>
-          <w:sz w:val="26"/>
-          <w:szCs w:val="26"/>
-        </w:rPr>
-        <w:t>UC-14: Set/View NextAction</w:t>
-      </w:r>
+        <w:t xml:space="preserve">User views </w:t>
+      </w:r>
+      <w:proofErr w:type="spellStart"/>
+      <w:r>
+        <w:rPr>
+          <w:rFonts w:ascii="Arial" w:eastAsia="Arial" w:hAnsi="Arial" w:cs="Arial"/>
+          <w:sz w:val="26"/>
+          <w:szCs w:val="26"/>
+        </w:rPr>
+        <w:t>ProgressLogEntry</w:t>
+      </w:r>
+      <w:proofErr w:type="spellEnd"/>
+      <w:r>
+        <w:rPr>
+          <w:rFonts w:ascii="Arial" w:eastAsia="Arial" w:hAnsi="Arial" w:cs="Arial"/>
+          <w:sz w:val="26"/>
+          <w:szCs w:val="26"/>
+        </w:rPr>
+        <w:t xml:space="preserve"> history for a task.</w:t>
+      </w:r>
+    </w:p>
+    <w:p>
+      <w:pPr>
+        <w:rPr>
+          <w:rFonts w:ascii="Arial" w:eastAsia="Arial" w:hAnsi="Arial" w:cs="Arial"/>
+          <w:sz w:val="26"/>
+          <w:szCs w:val="26"/>
+        </w:rPr>
+      </w:pPr>
+    </w:p>
+    <w:p>
+      <w:pPr>
+        <w:rPr>
+          <w:rFonts w:ascii="Arial" w:eastAsia="Arial" w:hAnsi="Arial" w:cs="Arial"/>
+          <w:sz w:val="26"/>
+          <w:szCs w:val="26"/>
+        </w:rPr>
+      </w:pPr>
+      <w:r>
+        <w:rPr>
+          <w:rFonts w:ascii="Arial" w:eastAsia="Arial" w:hAnsi="Arial" w:cs="Arial"/>
+          <w:sz w:val="26"/>
+          <w:szCs w:val="26"/>
+        </w:rPr>
+        <w:t xml:space="preserve">UC-14: Set/View </w:t>
+      </w:r>
+      <w:proofErr w:type="spellStart"/>
+      <w:r>
+        <w:rPr>
+          <w:rFonts w:ascii="Arial" w:eastAsia="Arial" w:hAnsi="Arial" w:cs="Arial"/>
+          <w:sz w:val="26"/>
+          <w:szCs w:val="26"/>
+        </w:rPr>
+        <w:t>NextAction</w:t>
+      </w:r>
+      <w:proofErr w:type="spellEnd"/>
     </w:p>
     <w:p>
       <w:pPr>
@@ -4175,24 +4665,60 @@
           <w:sz w:val="26"/>
           <w:szCs w:val="26"/>
         </w:rPr>
-        <w:t>- POST /api/auth/register</w:t>
-      </w:r>
-    </w:p>
-    <w:p>
-      <w:pPr>
-        <w:rPr>
-          <w:rFonts w:ascii="Arial" w:eastAsia="Arial" w:hAnsi="Arial" w:cs="Arial"/>
-          <w:sz w:val="26"/>
-          <w:szCs w:val="26"/>
-        </w:rPr>
-      </w:pPr>
-      <w:r>
-        <w:rPr>
-          <w:rFonts w:ascii="Arial" w:eastAsia="Arial" w:hAnsi="Arial" w:cs="Arial"/>
-          <w:sz w:val="26"/>
-          <w:szCs w:val="26"/>
-        </w:rPr>
-        <w:t>- POST /api/auth/login</w:t>
+        <w:t>- POST /</w:t>
+      </w:r>
+      <w:proofErr w:type="spellStart"/>
+      <w:r>
+        <w:rPr>
+          <w:rFonts w:ascii="Arial" w:eastAsia="Arial" w:hAnsi="Arial" w:cs="Arial"/>
+          <w:sz w:val="26"/>
+          <w:szCs w:val="26"/>
+        </w:rPr>
+        <w:t>api</w:t>
+      </w:r>
+      <w:proofErr w:type="spellEnd"/>
+      <w:r>
+        <w:rPr>
+          <w:rFonts w:ascii="Arial" w:eastAsia="Arial" w:hAnsi="Arial" w:cs="Arial"/>
+          <w:sz w:val="26"/>
+          <w:szCs w:val="26"/>
+        </w:rPr>
+        <w:t>/auth/register</w:t>
+      </w:r>
+    </w:p>
+    <w:p>
+      <w:pPr>
+        <w:rPr>
+          <w:rFonts w:ascii="Arial" w:eastAsia="Arial" w:hAnsi="Arial" w:cs="Arial"/>
+          <w:sz w:val="26"/>
+          <w:szCs w:val="26"/>
+        </w:rPr>
+      </w:pPr>
+      <w:r>
+        <w:rPr>
+          <w:rFonts w:ascii="Arial" w:eastAsia="Arial" w:hAnsi="Arial" w:cs="Arial"/>
+          <w:sz w:val="26"/>
+          <w:szCs w:val="26"/>
+        </w:rPr>
+        <w:t>- POST /</w:t>
+      </w:r>
+      <w:proofErr w:type="spellStart"/>
+      <w:r>
+        <w:rPr>
+          <w:rFonts w:ascii="Arial" w:eastAsia="Arial" w:hAnsi="Arial" w:cs="Arial"/>
+          <w:sz w:val="26"/>
+          <w:szCs w:val="26"/>
+        </w:rPr>
+        <w:t>api</w:t>
+      </w:r>
+      <w:proofErr w:type="spellEnd"/>
+      <w:r>
+        <w:rPr>
+          <w:rFonts w:ascii="Arial" w:eastAsia="Arial" w:hAnsi="Arial" w:cs="Arial"/>
+          <w:sz w:val="26"/>
+          <w:szCs w:val="26"/>
+        </w:rPr>
+        <w:t>/auth/login</w:t>
       </w:r>
     </w:p>
     <w:p>
@@ -4235,58 +4761,130 @@
           <w:sz w:val="26"/>
           <w:szCs w:val="26"/>
         </w:rPr>
-        <w:t>- GET /api/tasks</w:t>
-      </w:r>
-    </w:p>
-    <w:p>
-      <w:pPr>
-        <w:rPr>
-          <w:rFonts w:ascii="Arial" w:eastAsia="Arial" w:hAnsi="Arial" w:cs="Arial"/>
-          <w:sz w:val="26"/>
-          <w:szCs w:val="26"/>
-        </w:rPr>
-      </w:pPr>
-      <w:r>
-        <w:rPr>
-          <w:rFonts w:ascii="Arial" w:eastAsia="Arial" w:hAnsi="Arial" w:cs="Arial"/>
-          <w:sz w:val="26"/>
-          <w:szCs w:val="26"/>
-        </w:rPr>
-        <w:t>- POST /api/tasks</w:t>
-      </w:r>
-    </w:p>
-    <w:p>
-      <w:pPr>
-        <w:rPr>
-          <w:rFonts w:ascii="Arial" w:eastAsia="Arial" w:hAnsi="Arial" w:cs="Arial"/>
-          <w:sz w:val="26"/>
-          <w:szCs w:val="26"/>
-        </w:rPr>
-      </w:pPr>
-      <w:r>
-        <w:rPr>
-          <w:rFonts w:ascii="Arial" w:eastAsia="Arial" w:hAnsi="Arial" w:cs="Arial"/>
-          <w:sz w:val="26"/>
-          <w:szCs w:val="26"/>
-        </w:rPr>
-        <w:t>- PUT /api/tasks/{id}</w:t>
-      </w:r>
-    </w:p>
-    <w:p>
-      <w:pPr>
-        <w:rPr>
-          <w:rFonts w:ascii="Arial" w:eastAsia="Arial" w:hAnsi="Arial" w:cs="Arial"/>
-          <w:sz w:val="26"/>
-          <w:szCs w:val="26"/>
-        </w:rPr>
-      </w:pPr>
-      <w:r>
-        <w:rPr>
-          <w:rFonts w:ascii="Arial" w:eastAsia="Arial" w:hAnsi="Arial" w:cs="Arial"/>
-          <w:sz w:val="26"/>
-          <w:szCs w:val="26"/>
-        </w:rPr>
-        <w:t>- DELETE /api/tasks/{id}</w:t>
+        <w:t>- GET /</w:t>
+      </w:r>
+      <w:proofErr w:type="spellStart"/>
+      <w:r>
+        <w:rPr>
+          <w:rFonts w:ascii="Arial" w:eastAsia="Arial" w:hAnsi="Arial" w:cs="Arial"/>
+          <w:sz w:val="26"/>
+          <w:szCs w:val="26"/>
+        </w:rPr>
+        <w:t>api</w:t>
+      </w:r>
+      <w:proofErr w:type="spellEnd"/>
+      <w:r>
+        <w:rPr>
+          <w:rFonts w:ascii="Arial" w:eastAsia="Arial" w:hAnsi="Arial" w:cs="Arial"/>
+          <w:sz w:val="26"/>
+          <w:szCs w:val="26"/>
+        </w:rPr>
+        <w:t>/tasks</w:t>
+      </w:r>
+    </w:p>
+    <w:p>
+      <w:pPr>
+        <w:rPr>
+          <w:rFonts w:ascii="Arial" w:eastAsia="Arial" w:hAnsi="Arial" w:cs="Arial"/>
+          <w:sz w:val="26"/>
+          <w:szCs w:val="26"/>
+        </w:rPr>
+      </w:pPr>
+      <w:r>
+        <w:rPr>
+          <w:rFonts w:ascii="Arial" w:eastAsia="Arial" w:hAnsi="Arial" w:cs="Arial"/>
+          <w:sz w:val="26"/>
+          <w:szCs w:val="26"/>
+        </w:rPr>
+        <w:t>- POST /</w:t>
+      </w:r>
+      <w:proofErr w:type="spellStart"/>
+      <w:r>
+        <w:rPr>
+          <w:rFonts w:ascii="Arial" w:eastAsia="Arial" w:hAnsi="Arial" w:cs="Arial"/>
+          <w:sz w:val="26"/>
+          <w:szCs w:val="26"/>
+        </w:rPr>
+        <w:t>api</w:t>
+      </w:r>
+      <w:proofErr w:type="spellEnd"/>
+      <w:r>
+        <w:rPr>
+          <w:rFonts w:ascii="Arial" w:eastAsia="Arial" w:hAnsi="Arial" w:cs="Arial"/>
+          <w:sz w:val="26"/>
+          <w:szCs w:val="26"/>
+        </w:rPr>
+        <w:t>/tasks</w:t>
+      </w:r>
+    </w:p>
+    <w:p>
+      <w:pPr>
+        <w:rPr>
+          <w:rFonts w:ascii="Arial" w:eastAsia="Arial" w:hAnsi="Arial" w:cs="Arial"/>
+          <w:sz w:val="26"/>
+          <w:szCs w:val="26"/>
+        </w:rPr>
+      </w:pPr>
+      <w:r>
+        <w:rPr>
+          <w:rFonts w:ascii="Arial" w:eastAsia="Arial" w:hAnsi="Arial" w:cs="Arial"/>
+          <w:sz w:val="26"/>
+          <w:szCs w:val="26"/>
+        </w:rPr>
+        <w:t>- PUT /</w:t>
+      </w:r>
+      <w:proofErr w:type="spellStart"/>
+      <w:r>
+        <w:rPr>
+          <w:rFonts w:ascii="Arial" w:eastAsia="Arial" w:hAnsi="Arial" w:cs="Arial"/>
+          <w:sz w:val="26"/>
+          <w:szCs w:val="26"/>
+        </w:rPr>
+        <w:t>api</w:t>
+      </w:r>
+      <w:proofErr w:type="spellEnd"/>
+      <w:r>
+        <w:rPr>
+          <w:rFonts w:ascii="Arial" w:eastAsia="Arial" w:hAnsi="Arial" w:cs="Arial"/>
+          <w:sz w:val="26"/>
+          <w:szCs w:val="26"/>
+        </w:rPr>
+        <w:t>/tasks/{id}</w:t>
+      </w:r>
+    </w:p>
+    <w:p>
+      <w:pPr>
+        <w:rPr>
+          <w:rFonts w:ascii="Arial" w:eastAsia="Arial" w:hAnsi="Arial" w:cs="Arial"/>
+          <w:sz w:val="26"/>
+          <w:szCs w:val="26"/>
+        </w:rPr>
+      </w:pPr>
+      <w:r>
+        <w:rPr>
+          <w:rFonts w:ascii="Arial" w:eastAsia="Arial" w:hAnsi="Arial" w:cs="Arial"/>
+          <w:sz w:val="26"/>
+          <w:szCs w:val="26"/>
+        </w:rPr>
+        <w:t>- DELETE /</w:t>
+      </w:r>
+      <w:proofErr w:type="spellStart"/>
+      <w:r>
+        <w:rPr>
+          <w:rFonts w:ascii="Arial" w:eastAsia="Arial" w:hAnsi="Arial" w:cs="Arial"/>
+          <w:sz w:val="26"/>
+          <w:szCs w:val="26"/>
+        </w:rPr>
+        <w:t>api</w:t>
+      </w:r>
+      <w:proofErr w:type="spellEnd"/>
+      <w:r>
+        <w:rPr>
+          <w:rFonts w:ascii="Arial" w:eastAsia="Arial" w:hAnsi="Arial" w:cs="Arial"/>
+          <w:sz w:val="26"/>
+          <w:szCs w:val="26"/>
+        </w:rPr>
+        <w:t>/tasks/{id}</w:t>
       </w:r>
     </w:p>
     <w:p>
@@ -4329,43 +4927,388 @@
           <w:sz w:val="26"/>
           <w:szCs w:val="26"/>
         </w:rPr>
-        <w:t>- GET /api/tasks/{id}/progress</w:t>
-      </w:r>
-    </w:p>
-    <w:p>
-      <w:pPr>
-        <w:rPr>
-          <w:rFonts w:ascii="Arial" w:eastAsia="Arial" w:hAnsi="Arial" w:cs="Arial"/>
-          <w:sz w:val="26"/>
-          <w:szCs w:val="26"/>
-        </w:rPr>
-      </w:pPr>
-      <w:r>
-        <w:rPr>
-          <w:rFonts w:ascii="Arial" w:eastAsia="Arial" w:hAnsi="Arial" w:cs="Arial"/>
-          <w:sz w:val="26"/>
-          <w:szCs w:val="26"/>
-        </w:rPr>
-        <w:t>- POST /api/tasks/{id}/progress</w:t>
-      </w:r>
-    </w:p>
-    <w:p>
-      <w:pPr>
-        <w:rPr>
-          <w:rFonts w:ascii="Arial" w:eastAsia="Arial" w:hAnsi="Arial" w:cs="Arial"/>
-          <w:sz w:val="26"/>
-          <w:szCs w:val="26"/>
-        </w:rPr>
-      </w:pPr>
-    </w:p>
-    <w:p>
-      <w:pPr>
-        <w:rPr>
-          <w:rFonts w:ascii="Arial" w:eastAsia="Arial" w:hAnsi="Arial" w:cs="Arial"/>
-          <w:sz w:val="26"/>
-          <w:szCs w:val="26"/>
-        </w:rPr>
-      </w:pPr>
+        <w:t>- GET /</w:t>
+      </w:r>
+      <w:proofErr w:type="spellStart"/>
+      <w:r>
+        <w:rPr>
+          <w:rFonts w:ascii="Arial" w:eastAsia="Arial" w:hAnsi="Arial" w:cs="Arial"/>
+          <w:sz w:val="26"/>
+          <w:szCs w:val="26"/>
+        </w:rPr>
+        <w:t>api</w:t>
+      </w:r>
+      <w:proofErr w:type="spellEnd"/>
+      <w:r>
+        <w:rPr>
+          <w:rFonts w:ascii="Arial" w:eastAsia="Arial" w:hAnsi="Arial" w:cs="Arial"/>
+          <w:sz w:val="26"/>
+          <w:szCs w:val="26"/>
+        </w:rPr>
+        <w:t>/tasks/{id}/progress</w:t>
+      </w:r>
+    </w:p>
+    <w:p>
+      <w:pPr>
+        <w:rPr>
+          <w:rFonts w:ascii="Arial" w:eastAsia="Arial" w:hAnsi="Arial" w:cs="Arial"/>
+          <w:sz w:val="26"/>
+          <w:szCs w:val="26"/>
+        </w:rPr>
+      </w:pPr>
+      <w:r>
+        <w:rPr>
+          <w:rFonts w:ascii="Arial" w:eastAsia="Arial" w:hAnsi="Arial" w:cs="Arial"/>
+          <w:sz w:val="26"/>
+          <w:szCs w:val="26"/>
+        </w:rPr>
+        <w:t>- POST /</w:t>
+      </w:r>
+      <w:proofErr w:type="spellStart"/>
+      <w:r>
+        <w:rPr>
+          <w:rFonts w:ascii="Arial" w:eastAsia="Arial" w:hAnsi="Arial" w:cs="Arial"/>
+          <w:sz w:val="26"/>
+          <w:szCs w:val="26"/>
+        </w:rPr>
+        <w:t>api</w:t>
+      </w:r>
+      <w:proofErr w:type="spellEnd"/>
+      <w:r>
+        <w:rPr>
+          <w:rFonts w:ascii="Arial" w:eastAsia="Arial" w:hAnsi="Arial" w:cs="Arial"/>
+          <w:sz w:val="26"/>
+          <w:szCs w:val="26"/>
+        </w:rPr>
+        <w:t>/tasks/{id}/progress</w:t>
+      </w:r>
+    </w:p>
+    <w:p>
+      <w:pPr>
+        <w:rPr>
+          <w:rFonts w:ascii="Arial" w:eastAsia="Arial" w:hAnsi="Arial" w:cs="Arial"/>
+          <w:sz w:val="26"/>
+          <w:szCs w:val="26"/>
+        </w:rPr>
+      </w:pPr>
+    </w:p>
+    <w:p>
+      <w:pPr>
+        <w:rPr>
+          <w:rFonts w:ascii="Arial" w:eastAsia="Arial" w:hAnsi="Arial" w:cs="Arial"/>
+          <w:sz w:val="26"/>
+          <w:szCs w:val="26"/>
+        </w:rPr>
+      </w:pPr>
+      <w:r>
+        <w:rPr>
+          <w:rFonts w:ascii="Arial" w:eastAsia="Arial" w:hAnsi="Arial" w:cs="Arial"/>
+          <w:sz w:val="26"/>
+          <w:szCs w:val="26"/>
+        </w:rPr>
+        <w:t>14. Changelog</w:t>
+      </w:r>
+    </w:p>
+    <w:p>
+      <w:pPr>
+        <w:rPr>
+          <w:rFonts w:ascii="Arial" w:eastAsia="Arial" w:hAnsi="Arial" w:cs="Arial"/>
+          <w:sz w:val="26"/>
+          <w:szCs w:val="26"/>
+        </w:rPr>
+      </w:pPr>
+    </w:p>
+    <w:p>
+      <w:pPr>
+        <w:rPr>
+          <w:rFonts w:ascii="Arial" w:eastAsia="Arial" w:hAnsi="Arial" w:cs="Arial"/>
+          <w:sz w:val="26"/>
+          <w:szCs w:val="26"/>
+        </w:rPr>
+      </w:pPr>
+      <w:r>
+        <w:rPr>
+          <w:rFonts w:ascii="Arial" w:eastAsia="Arial" w:hAnsi="Arial" w:cs="Arial"/>
+          <w:sz w:val="26"/>
+          <w:szCs w:val="26"/>
+        </w:rPr>
+        <w:t>v1.1 (Week 3)</w:t>
+      </w:r>
+    </w:p>
+    <w:p>
+      <w:pPr>
+        <w:rPr>
+          <w:rFonts w:ascii="Arial" w:eastAsia="Arial" w:hAnsi="Arial" w:cs="Arial"/>
+          <w:sz w:val="26"/>
+          <w:szCs w:val="26"/>
+        </w:rPr>
+      </w:pPr>
+      <w:r>
+        <w:rPr>
+          <w:rFonts w:ascii="Arial" w:eastAsia="Arial" w:hAnsi="Arial" w:cs="Arial"/>
+          <w:sz w:val="26"/>
+          <w:szCs w:val="26"/>
+        </w:rPr>
+        <w:t>- Simplified MVP scope to focus on core task management features</w:t>
+      </w:r>
+    </w:p>
+    <w:p>
+      <w:pPr>
+        <w:rPr>
+          <w:rFonts w:ascii="Arial" w:eastAsia="Arial" w:hAnsi="Arial" w:cs="Arial"/>
+          <w:sz w:val="26"/>
+          <w:szCs w:val="26"/>
+        </w:rPr>
+      </w:pPr>
+      <w:r>
+        <w:rPr>
+          <w:rFonts w:ascii="Arial" w:eastAsia="Arial" w:hAnsi="Arial" w:cs="Arial"/>
+          <w:sz w:val="26"/>
+          <w:szCs w:val="26"/>
+        </w:rPr>
+        <w:t>- Removed subtasks, archiving, and advanced prioritization from MVP</w:t>
+      </w:r>
+    </w:p>
+    <w:p>
+      <w:pPr>
+        <w:rPr>
+          <w:rFonts w:ascii="Arial" w:eastAsia="Arial" w:hAnsi="Arial" w:cs="Arial"/>
+          <w:sz w:val="26"/>
+          <w:szCs w:val="26"/>
+        </w:rPr>
+      </w:pPr>
+      <w:r>
+        <w:rPr>
+          <w:rFonts w:ascii="Arial" w:eastAsia="Arial" w:hAnsi="Arial" w:cs="Arial"/>
+          <w:sz w:val="26"/>
+          <w:szCs w:val="26"/>
+        </w:rPr>
+        <w:t xml:space="preserve">- Introduced Progress Log and </w:t>
+      </w:r>
+      <w:proofErr w:type="spellStart"/>
+      <w:r>
+        <w:rPr>
+          <w:rFonts w:ascii="Arial" w:eastAsia="Arial" w:hAnsi="Arial" w:cs="Arial"/>
+          <w:sz w:val="26"/>
+          <w:szCs w:val="26"/>
+        </w:rPr>
+        <w:t>NextAction</w:t>
+      </w:r>
+      <w:proofErr w:type="spellEnd"/>
+      <w:r>
+        <w:rPr>
+          <w:rFonts w:ascii="Arial" w:eastAsia="Arial" w:hAnsi="Arial" w:cs="Arial"/>
+          <w:sz w:val="26"/>
+          <w:szCs w:val="26"/>
+        </w:rPr>
+        <w:t xml:space="preserve"> for task continuity</w:t>
+      </w:r>
+    </w:p>
+    <w:p>
+      <w:pPr>
+        <w:rPr>
+          <w:rFonts w:ascii="Arial" w:eastAsia="Arial" w:hAnsi="Arial" w:cs="Arial"/>
+          <w:sz w:val="26"/>
+          <w:szCs w:val="26"/>
+        </w:rPr>
+      </w:pPr>
+      <w:r>
+        <w:rPr>
+          <w:rFonts w:ascii="Arial" w:eastAsia="Arial" w:hAnsi="Arial" w:cs="Arial"/>
+          <w:sz w:val="26"/>
+          <w:szCs w:val="26"/>
+        </w:rPr>
+        <w:t>- Refined sorting and overdue logic</w:t>
+      </w:r>
+    </w:p>
+    <w:p>
+      <w:pPr>
+        <w:rPr>
+          <w:rFonts w:ascii="Arial" w:eastAsia="Arial" w:hAnsi="Arial" w:cs="Arial"/>
+          <w:sz w:val="26"/>
+          <w:szCs w:val="26"/>
+        </w:rPr>
+      </w:pPr>
+      <w:r>
+        <w:rPr>
+          <w:rFonts w:ascii="Arial" w:eastAsia="Arial" w:hAnsi="Arial" w:cs="Arial"/>
+          <w:sz w:val="26"/>
+          <w:szCs w:val="26"/>
+        </w:rPr>
+        <w:t>- Improved consistency across requirements, data model, and API</w:t>
+      </w:r>
+    </w:p>
+    <w:p>
+      <w:pPr>
+        <w:rPr>
+          <w:rFonts w:ascii="Arial" w:eastAsia="Arial" w:hAnsi="Arial" w:cs="Arial"/>
+          <w:sz w:val="26"/>
+          <w:szCs w:val="26"/>
+        </w:rPr>
+      </w:pPr>
+    </w:p>
+    <w:p>
+      <w:pPr>
+        <w:rPr>
+          <w:rFonts w:ascii="Arial" w:eastAsia="Arial" w:hAnsi="Arial" w:cs="Arial"/>
+          <w:sz w:val="26"/>
+          <w:szCs w:val="26"/>
+        </w:rPr>
+      </w:pPr>
+      <w:r>
+        <w:rPr>
+          <w:rFonts w:ascii="Arial" w:eastAsia="Arial" w:hAnsi="Arial" w:cs="Arial"/>
+          <w:sz w:val="26"/>
+          <w:szCs w:val="26"/>
+        </w:rPr>
+        <w:t>v0.4</w:t>
+      </w:r>
+    </w:p>
+    <w:p>
+      <w:pPr>
+        <w:rPr>
+          <w:rFonts w:ascii="Arial" w:eastAsia="Arial" w:hAnsi="Arial" w:cs="Arial"/>
+          <w:sz w:val="26"/>
+          <w:szCs w:val="26"/>
+        </w:rPr>
+      </w:pPr>
+      <w:r>
+        <w:rPr>
+          <w:rFonts w:ascii="Arial" w:eastAsia="Arial" w:hAnsi="Arial" w:cs="Arial"/>
+          <w:sz w:val="26"/>
+          <w:szCs w:val="26"/>
+        </w:rPr>
+        <w:t>- Expanded scope to include subtasks, progress notes, and prioritization factors</w:t>
+      </w:r>
+    </w:p>
+    <w:p>
+      <w:pPr>
+        <w:rPr>
+          <w:rFonts w:ascii="Arial" w:eastAsia="Arial" w:hAnsi="Arial" w:cs="Arial"/>
+          <w:sz w:val="26"/>
+          <w:szCs w:val="26"/>
+        </w:rPr>
+      </w:pPr>
+      <w:r>
+        <w:rPr>
+          <w:rFonts w:ascii="Arial" w:eastAsia="Arial" w:hAnsi="Arial" w:cs="Arial"/>
+          <w:sz w:val="26"/>
+          <w:szCs w:val="26"/>
+        </w:rPr>
+        <w:t>- Added more detailed task states and workflow behavior</w:t>
+      </w:r>
+    </w:p>
+    <w:p>
+      <w:pPr>
+        <w:rPr>
+          <w:rFonts w:ascii="Arial" w:eastAsia="Arial" w:hAnsi="Arial" w:cs="Arial"/>
+          <w:sz w:val="26"/>
+          <w:szCs w:val="26"/>
+        </w:rPr>
+      </w:pPr>
+      <w:r>
+        <w:rPr>
+          <w:rFonts w:ascii="Arial" w:eastAsia="Arial" w:hAnsi="Arial" w:cs="Arial"/>
+          <w:sz w:val="26"/>
+          <w:szCs w:val="26"/>
+        </w:rPr>
+        <w:t>- Introduced task notes and archival concepts</w:t>
+      </w:r>
+    </w:p>
+    <w:p>
+      <w:pPr>
+        <w:rPr>
+          <w:rFonts w:ascii="Arial" w:eastAsia="Arial" w:hAnsi="Arial" w:cs="Arial"/>
+          <w:sz w:val="26"/>
+          <w:szCs w:val="26"/>
+        </w:rPr>
+      </w:pPr>
+      <w:r>
+        <w:rPr>
+          <w:rFonts w:ascii="Arial" w:eastAsia="Arial" w:hAnsi="Arial" w:cs="Arial"/>
+          <w:sz w:val="26"/>
+          <w:szCs w:val="26"/>
+        </w:rPr>
+        <w:t>- Expanded use cases and data model</w:t>
+      </w:r>
+    </w:p>
+    <w:p>
+      <w:pPr>
+        <w:rPr>
+          <w:rFonts w:ascii="Arial" w:eastAsia="Arial" w:hAnsi="Arial" w:cs="Arial"/>
+          <w:sz w:val="26"/>
+          <w:szCs w:val="26"/>
+        </w:rPr>
+      </w:pPr>
+    </w:p>
+    <w:p>
+      <w:pPr>
+        <w:rPr>
+          <w:rFonts w:ascii="Arial" w:eastAsia="Arial" w:hAnsi="Arial" w:cs="Arial"/>
+          <w:sz w:val="26"/>
+          <w:szCs w:val="26"/>
+        </w:rPr>
+      </w:pPr>
+      <w:r>
+        <w:rPr>
+          <w:rFonts w:ascii="Arial" w:eastAsia="Arial" w:hAnsi="Arial" w:cs="Arial"/>
+          <w:sz w:val="26"/>
+          <w:szCs w:val="26"/>
+        </w:rPr>
+        <w:t>v0.2</w:t>
+      </w:r>
+    </w:p>
+    <w:p>
+      <w:pPr>
+        <w:rPr>
+          <w:rFonts w:ascii="Arial" w:eastAsia="Arial" w:hAnsi="Arial" w:cs="Arial"/>
+          <w:sz w:val="26"/>
+          <w:szCs w:val="26"/>
+        </w:rPr>
+      </w:pPr>
+      <w:r>
+        <w:rPr>
+          <w:rFonts w:ascii="Arial" w:eastAsia="Arial" w:hAnsi="Arial" w:cs="Arial"/>
+          <w:sz w:val="26"/>
+          <w:szCs w:val="26"/>
+        </w:rPr>
+        <w:lastRenderedPageBreak/>
+        <w:t>- Initial draft of system requirements and core concept</w:t>
+      </w:r>
+    </w:p>
+    <w:p>
+      <w:pPr>
+        <w:rPr>
+          <w:rFonts w:ascii="Arial" w:eastAsia="Arial" w:hAnsi="Arial" w:cs="Arial"/>
+          <w:sz w:val="26"/>
+          <w:szCs w:val="26"/>
+        </w:rPr>
+      </w:pPr>
+      <w:r>
+        <w:rPr>
+          <w:rFonts w:ascii="Arial" w:eastAsia="Arial" w:hAnsi="Arial" w:cs="Arial"/>
+          <w:sz w:val="26"/>
+          <w:szCs w:val="26"/>
+        </w:rPr>
+        <w:t>- Defined basic task management and revisit rule</w:t>
+      </w:r>
+    </w:p>
+    <w:p>
+      <w:pPr>
+        <w:rPr>
+          <w:rFonts w:ascii="Arial" w:eastAsia="Arial" w:hAnsi="Arial" w:cs="Arial"/>
+          <w:sz w:val="26"/>
+          <w:szCs w:val="26"/>
+        </w:rPr>
+      </w:pPr>
+      <w:r>
+        <w:rPr>
+          <w:rFonts w:ascii="Arial" w:eastAsia="Arial" w:hAnsi="Arial" w:cs="Arial"/>
+          <w:sz w:val="26"/>
+          <w:szCs w:val="26"/>
+        </w:rPr>
+        <w:t>- Established initial scope and architecture</w:t>
+      </w:r>
     </w:p>
     <w:sectPr>
       <w:pgSz w:w="12240" w:h="15840"/>

</xml_diff>